<commit_message>
updates for v5.0, mainly data model and config updates to support LMD
</commit_message>
<xml_diff>
--- a/v5.0/Configuration/ERM Web Application Configuration.docx
+++ b/v5.0/Configuration/ERM Web Application Configuration.docx
@@ -51,7 +51,7 @@
           <w:sz w:val="18"/>
           <w:szCs w:val="24"/>
         </w:rPr>
-        <w:t>April 10, 2026</w:t>
+        <w:t>April 11, 2026</w:t>
       </w:r>
       <w:r>
         <w:rPr>
@@ -124,13 +124,13 @@
         </w:sectPr>
       </w:pPr>
     </w:p>
-    <w:bookmarkStart w:id="0" w:name="_Toc516213319" w:displacedByCustomXml="next"/>
+    <w:bookmarkStart w:id="0" w:name="_Toc516213353" w:displacedByCustomXml="next"/>
     <w:bookmarkEnd w:id="0" w:displacedByCustomXml="next"/>
-    <w:bookmarkStart w:id="1" w:name="_Toc516213340" w:displacedByCustomXml="next"/>
+    <w:bookmarkStart w:id="1" w:name="_Toc516213349" w:displacedByCustomXml="next"/>
     <w:bookmarkEnd w:id="1" w:displacedByCustomXml="next"/>
-    <w:bookmarkStart w:id="2" w:name="_Toc516213349" w:displacedByCustomXml="next"/>
+    <w:bookmarkStart w:id="2" w:name="_Toc516213340" w:displacedByCustomXml="next"/>
     <w:bookmarkEnd w:id="2" w:displacedByCustomXml="next"/>
-    <w:bookmarkStart w:id="3" w:name="_Toc516213353" w:displacedByCustomXml="next"/>
+    <w:bookmarkStart w:id="3" w:name="_Toc516213319" w:displacedByCustomXml="next"/>
     <w:bookmarkEnd w:id="3" w:displacedByCustomXml="next"/>
     <w:sdt>
       <w:sdtPr>
@@ -4086,6 +4086,56 @@
       <w:r>
         <w:lastRenderedPageBreak/>
         <w:t>If left blank, will display the “default” values: Specialty, Orders, Earliest Start Time, Total Cost, Total Time.</w:t>
+      </w:r>
+    </w:p>
+    <w:p>
+      <w:pPr>
+        <w:pStyle w:val="EsriBullet"/>
+      </w:pPr>
+      <w:r>
+        <w:t>“</w:t>
+      </w:r>
+      <w:r>
+        <w:t>showZoneNameDropdown</w:t>
+      </w:r>
+      <w:r>
+        <w:t>”</w:t>
+      </w:r>
+    </w:p>
+    <w:p>
+      <w:pPr>
+        <w:pStyle w:val="EsriBullet"/>
+        <w:numPr>
+          <w:ilvl w:val="1"/>
+          <w:numId w:val="10"/>
+        </w:numPr>
+      </w:pPr>
+      <w:r>
+        <w:t>Only applicable if using LMD solver where data model has a Zone Name field on Routes.</w:t>
+      </w:r>
+    </w:p>
+    <w:p>
+      <w:pPr>
+        <w:pStyle w:val="EsriBullet"/>
+        <w:numPr>
+          <w:ilvl w:val="1"/>
+          <w:numId w:val="10"/>
+        </w:numPr>
+      </w:pPr>
+      <w:r>
+        <w:t>When true will show a dropdown of all available Zones to assign to Route.</w:t>
+      </w:r>
+    </w:p>
+    <w:p>
+      <w:pPr>
+        <w:pStyle w:val="EsriBullet"/>
+        <w:numPr>
+          <w:ilvl w:val="1"/>
+          <w:numId w:val="10"/>
+        </w:numPr>
+      </w:pPr>
+      <w:r>
+        <w:t>When false the user will need to type in Zone Name value.</w:t>
       </w:r>
     </w:p>
     <w:p>
@@ -7875,7 +7925,11 @@
           </mc:Choice>
           <mc:Fallback>
             <w:pict>
-              <v:shape w14:anchorId="4588112B" id="_x0000_s1028" type="#_x0000_t202" style="width:205.35pt;height:257.3pt;visibility:visible;mso-wrap-style:square;mso-left-percent:-10001;mso-top-percent:-10001;mso-position-horizontal:absolute;mso-position-horizontal-relative:char;mso-position-vertical:absolute;mso-position-vertical-relative:line;mso-left-percent:-10001;mso-top-percent:-10001;v-text-anchor:top" o:gfxdata="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">
+              <v:shapetype w14:anchorId="4588112B" id="_x0000_t202" coordsize="21600,21600" o:spt="202" path="m,l,21600r21600,l21600,xe">
+                <v:stroke joinstyle="miter"/>
+                <v:path gradientshapeok="t" o:connecttype="rect"/>
+              </v:shapetype>
+              <v:shape id="_x0000_s1028" type="#_x0000_t202" style="width:205.35pt;height:257.3pt;visibility:visible;mso-wrap-style:square;mso-left-percent:-10001;mso-top-percent:-10001;mso-position-horizontal:absolute;mso-position-horizontal-relative:char;mso-position-vertical:absolute;mso-position-vertical-relative:line;mso-left-percent:-10001;mso-top-percent:-10001;v-text-anchor:top" o:gfxdata="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">
                 <v:textbox>
                   <w:txbxContent>
                     <w:tbl>
@@ -10350,10 +10404,7 @@
         <w:t xml:space="preserve"> </w:t>
       </w:r>
       <w:r>
-        <w:t>ishardzone</w:t>
-      </w:r>
-      <w:r>
-        <w:t xml:space="preserve"> field, the Route table will show that. This would be for LMD solver.</w:t>
+        <w:t>ishardzone field, the Route table will show that. This would be for LMD solver.</w:t>
       </w:r>
     </w:p>
     <w:p>
@@ -10629,7 +10680,7 @@
                   </a:ln>
                   <a:extLst>
                     <a:ext uri="{FAA26D3D-D897-4be2-8F04-BA451C77F1D7}">
-                      <ma14:placeholderFlag xmlns:ma14="http://schemas.microsoft.com/office/mac/drawingml/2011/main" xmlns:w="http://schemas.openxmlformats.org/wordprocessingml/2006/main" xmlns:w10="urn:schemas-microsoft-com:office:word" xmlns:v="urn:schemas-microsoft-com:vml" xmlns:o="urn:schemas-microsoft-com:office:office" xmlns:mv="urn:schemas-microsoft-com:mac:vml" xmlns:mo="http://schemas.microsoft.com/office/mac/office/2008/main" xmlns="" xmlns:arto="http://schemas.microsoft.com/office/word/2006/arto" xmlns:a14="http://schemas.microsoft.com/office/drawing/2010/main"/>
+                      <ma14:placeholderFlag xmlns:a14="http://schemas.microsoft.com/office/drawing/2010/main" xmlns:arto="http://schemas.microsoft.com/office/word/2006/arto" xmlns="" xmlns:mo="http://schemas.microsoft.com/office/mac/office/2008/main" xmlns:mv="urn:schemas-microsoft-com:mac:vml" xmlns:o="urn:schemas-microsoft-com:office:office" xmlns:v="urn:schemas-microsoft-com:vml" xmlns:w10="urn:schemas-microsoft-com:office:word" xmlns:w="http://schemas.openxmlformats.org/wordprocessingml/2006/main" xmlns:ma14="http://schemas.microsoft.com/office/mac/drawingml/2011/main"/>
                     </a:ext>
                   </a:extLst>
                 </pic:spPr>
@@ -16784,7 +16835,12 @@
 </file>
 
 <file path=customXml/item2.xml><?xml version="1.0" encoding="utf-8"?>
-<b:Sources xmlns:b="http://schemas.openxmlformats.org/officeDocument/2006/bibliography" xmlns="http://schemas.openxmlformats.org/officeDocument/2006/bibliography" SelectedStyle="\APASixthEditionOfficeOnline.xsl" StyleName="APA" Version="6"/>
+<?mso-contentType ?>
+<FormTemplates xmlns="http://schemas.microsoft.com/sharepoint/v3/contenttype/forms">
+  <Display>DocumentLibraryForm</Display>
+  <Edit>DocumentLibraryForm</Edit>
+  <New>DocumentLibraryForm</New>
+</FormTemplates>
 </file>
 
 <file path=customXml/item3.xml><?xml version="1.0" encoding="utf-8"?>
@@ -17005,12 +17061,7 @@
 </file>
 
 <file path=customXml/item4.xml><?xml version="1.0" encoding="utf-8"?>
-<?mso-contentType ?>
-<FormTemplates xmlns="http://schemas.microsoft.com/sharepoint/v3/contenttype/forms">
-  <Display>DocumentLibraryForm</Display>
-  <Edit>DocumentLibraryForm</Edit>
-  <New>DocumentLibraryForm</New>
-</FormTemplates>
+<b:Sources xmlns:b="http://schemas.openxmlformats.org/officeDocument/2006/bibliography" xmlns="http://schemas.openxmlformats.org/officeDocument/2006/bibliography" SelectedStyle="\APASixthEditionOfficeOnline.xsl" StyleName="APA" Version="6"/>
 </file>
 
 <file path=customXml/itemProps1.xml><?xml version="1.0" encoding="utf-8"?>
@@ -17023,9 +17074,9 @@
 </file>
 
 <file path=customXml/itemProps2.xml><?xml version="1.0" encoding="utf-8"?>
-<ds:datastoreItem xmlns:ds="http://schemas.openxmlformats.org/officeDocument/2006/customXml" ds:itemID="{66611CF9-9C88-410D-9E2F-AB734F7B1560}">
+<ds:datastoreItem xmlns:ds="http://schemas.openxmlformats.org/officeDocument/2006/customXml" ds:itemID="{2080074E-29EC-4151-9623-994429932D6D}">
   <ds:schemaRefs>
-    <ds:schemaRef ds:uri="http://schemas.openxmlformats.org/officeDocument/2006/bibliography"/>
+    <ds:schemaRef ds:uri="http://schemas.microsoft.com/sharepoint/v3/contenttype/forms"/>
   </ds:schemaRefs>
 </ds:datastoreItem>
 </file>
@@ -17050,9 +17101,9 @@
 </file>
 
 <file path=customXml/itemProps4.xml><?xml version="1.0" encoding="utf-8"?>
-<ds:datastoreItem xmlns:ds="http://schemas.openxmlformats.org/officeDocument/2006/customXml" ds:itemID="{2080074E-29EC-4151-9623-994429932D6D}">
+<ds:datastoreItem xmlns:ds="http://schemas.openxmlformats.org/officeDocument/2006/customXml" ds:itemID="{66611CF9-9C88-410D-9E2F-AB734F7B1560}">
   <ds:schemaRefs>
-    <ds:schemaRef ds:uri="http://schemas.microsoft.com/sharepoint/v3/contenttype/forms"/>
+    <ds:schemaRef ds:uri="http://schemas.openxmlformats.org/officeDocument/2006/bibliography"/>
   </ds:schemaRefs>
 </ds:datastoreItem>
 </file>
</xml_diff>